<commit_message>
added the start of the book
</commit_message>
<xml_diff>
--- a/הצעת פרוייקט מעודכנת.docx
+++ b/הצעת פרוייקט מעודכנת.docx
@@ -530,7 +530,7 @@
               </wp:inline>
             </w:drawing>
           </mc:Choice>
-          <mc:Fallback xmlns:oel="http://schemas.microsoft.com/office/2019/extlst" xmlns:w16du="http://schemas.microsoft.com/office/word/2023/wordml/word16du" xmlns:w16sdtdh="http://schemas.microsoft.com/office/word/2020/wordml/sdtdatahash" xmlns:w16="http://schemas.microsoft.com/office/word/2018/wordml" xmlns:w16cex="http://schemas.microsoft.com/office/word/2018/wordml/cex">
+          <mc:Fallback xmlns:w16cex="http://schemas.microsoft.com/office/word/2018/wordml/cex" xmlns:w16="http://schemas.microsoft.com/office/word/2018/wordml" xmlns:w16sdtdh="http://schemas.microsoft.com/office/word/2020/wordml/sdtdatahash" xmlns:w16du="http://schemas.microsoft.com/office/word/2023/wordml/word16du" xmlns:oel="http://schemas.microsoft.com/office/2019/extlst">
             <w:pict>
               <v:roundrect w14:anchorId="17ED87AC" id="מלבן מעוגל 6" o:spid="_x0000_s1026" style="width:9.45pt;height:9.45pt;visibility:visible;mso-wrap-style:square;mso-left-percent:-10001;mso-top-percent:-10001;mso-position-horizontal:absolute;mso-position-horizontal-relative:char;mso-position-vertical:absolute;mso-position-vertical-relative:line;mso-left-percent:-10001;mso-top-percent:-10001;v-text-anchor:top" arcsize="10923f" o:gfxdata="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" fillcolor="#a8d08d">
                 <o:lock v:ext="edit" aspectratio="t"/>
@@ -666,7 +666,7 @@
               </wp:inline>
             </w:drawing>
           </mc:Choice>
-          <mc:Fallback xmlns:oel="http://schemas.microsoft.com/office/2019/extlst" xmlns:w16du="http://schemas.microsoft.com/office/word/2023/wordml/word16du" xmlns:w16sdtdh="http://schemas.microsoft.com/office/word/2020/wordml/sdtdatahash" xmlns:w16="http://schemas.microsoft.com/office/word/2018/wordml" xmlns:w16cex="http://schemas.microsoft.com/office/word/2018/wordml/cex">
+          <mc:Fallback xmlns:w16cex="http://schemas.microsoft.com/office/word/2018/wordml/cex" xmlns:w16="http://schemas.microsoft.com/office/word/2018/wordml" xmlns:w16sdtdh="http://schemas.microsoft.com/office/word/2020/wordml/sdtdatahash" xmlns:w16du="http://schemas.microsoft.com/office/word/2023/wordml/word16du" xmlns:oel="http://schemas.microsoft.com/office/2019/extlst">
             <w:pict>
               <v:roundrect w14:anchorId="075500E5" id="מלבן מעוגל 5" o:spid="_x0000_s1026" style="width:9.45pt;height:9.45pt;visibility:visible;mso-wrap-style:square;mso-left-percent:-10001;mso-top-percent:-10001;mso-position-horizontal:absolute;mso-position-horizontal-relative:char;mso-position-vertical:absolute;mso-position-vertical-relative:line;mso-left-percent:-10001;mso-top-percent:-10001;v-text-anchor:top" arcsize="10923f" o:gfxdata="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">
                 <o:lock v:ext="edit" aspectratio="t"/>
@@ -4189,8 +4189,6 @@
           <w:rtl/>
         </w:rPr>
       </w:pPr>
-      <w:bookmarkStart w:id="2" w:name="_GoBack"/>
-      <w:bookmarkEnd w:id="2"/>
       <w:r>
         <w:rPr>
           <w:rFonts w:cs="Arial" w:hint="cs"/>
@@ -4332,7 +4330,7 @@
               </wp:inline>
             </w:drawing>
           </mc:Choice>
-          <mc:Fallback xmlns:oel="http://schemas.microsoft.com/office/2019/extlst" xmlns:w16du="http://schemas.microsoft.com/office/word/2023/wordml/word16du" xmlns:w16sdtdh="http://schemas.microsoft.com/office/word/2020/wordml/sdtdatahash" xmlns:w16="http://schemas.microsoft.com/office/word/2018/wordml" xmlns:w16cex="http://schemas.microsoft.com/office/word/2018/wordml/cex">
+          <mc:Fallback xmlns:w16cex="http://schemas.microsoft.com/office/word/2018/wordml/cex" xmlns:w16="http://schemas.microsoft.com/office/word/2018/wordml" xmlns:w16sdtdh="http://schemas.microsoft.com/office/word/2020/wordml/sdtdatahash" xmlns:w16du="http://schemas.microsoft.com/office/word/2023/wordml/word16du" xmlns:oel="http://schemas.microsoft.com/office/2019/extlst">
             <w:pict>
               <v:roundrect w14:anchorId="1D42CF48" id="מלבן מעוגל 4" o:spid="_x0000_s1026" style="width:9.45pt;height:9.45pt;visibility:visible;mso-wrap-style:square;mso-left-percent:-10001;mso-top-percent:-10001;mso-position-horizontal:absolute;mso-position-horizontal-relative:char;mso-position-vertical:absolute;mso-position-vertical-relative:line;mso-left-percent:-10001;mso-top-percent:-10001;v-text-anchor:top" arcsize="10923f" o:gfxdata="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">
                 <o:lock v:ext="edit" aspectratio="t"/>
@@ -4419,7 +4417,7 @@
               </wp:inline>
             </w:drawing>
           </mc:Choice>
-          <mc:Fallback xmlns:oel="http://schemas.microsoft.com/office/2019/extlst" xmlns:w16du="http://schemas.microsoft.com/office/word/2023/wordml/word16du" xmlns:w16sdtdh="http://schemas.microsoft.com/office/word/2020/wordml/sdtdatahash" xmlns:w16="http://schemas.microsoft.com/office/word/2018/wordml" xmlns:w16cex="http://schemas.microsoft.com/office/word/2018/wordml/cex">
+          <mc:Fallback xmlns:w16cex="http://schemas.microsoft.com/office/word/2018/wordml/cex" xmlns:w16="http://schemas.microsoft.com/office/word/2018/wordml" xmlns:w16sdtdh="http://schemas.microsoft.com/office/word/2020/wordml/sdtdatahash" xmlns:w16du="http://schemas.microsoft.com/office/word/2023/wordml/word16du" xmlns:oel="http://schemas.microsoft.com/office/2019/extlst">
             <w:pict>
               <v:roundrect w14:anchorId="070688B8" id="מלבן מעוגל 3" o:spid="_x0000_s1026" style="width:9.45pt;height:9.45pt;visibility:visible;mso-wrap-style:square;mso-left-percent:-10001;mso-top-percent:-10001;mso-position-horizontal:absolute;mso-position-horizontal-relative:char;mso-position-vertical:absolute;mso-position-vertical-relative:line;mso-left-percent:-10001;mso-top-percent:-10001;v-text-anchor:top" arcsize="10923f" o:gfxdata="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">
                 <o:lock v:ext="edit" aspectratio="t"/>
@@ -4552,7 +4550,7 @@
               </wp:inline>
             </w:drawing>
           </mc:Choice>
-          <mc:Fallback xmlns:oel="http://schemas.microsoft.com/office/2019/extlst" xmlns:w16du="http://schemas.microsoft.com/office/word/2023/wordml/word16du" xmlns:w16sdtdh="http://schemas.microsoft.com/office/word/2020/wordml/sdtdatahash" xmlns:w16="http://schemas.microsoft.com/office/word/2018/wordml" xmlns:w16cex="http://schemas.microsoft.com/office/word/2018/wordml/cex">
+          <mc:Fallback xmlns:w16cex="http://schemas.microsoft.com/office/word/2018/wordml/cex" xmlns:w16="http://schemas.microsoft.com/office/word/2018/wordml" xmlns:w16sdtdh="http://schemas.microsoft.com/office/word/2020/wordml/sdtdatahash" xmlns:w16du="http://schemas.microsoft.com/office/word/2023/wordml/word16du" xmlns:oel="http://schemas.microsoft.com/office/2019/extlst">
             <w:pict>
               <v:roundrect w14:anchorId="10070B32" id="מלבן מעוגל 2" o:spid="_x0000_s1026" style="width:9.45pt;height:9.45pt;visibility:visible;mso-wrap-style:square;mso-left-percent:-10001;mso-top-percent:-10001;mso-position-horizontal:absolute;mso-position-horizontal-relative:char;mso-position-vertical:absolute;mso-position-vertical-relative:line;mso-left-percent:-10001;mso-top-percent:-10001;v-text-anchor:top" arcsize="10923f" o:gfxdata="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">
                 <o:lock v:ext="edit" aspectratio="t"/>
@@ -4702,7 +4700,7 @@
               </wp:inline>
             </w:drawing>
           </mc:Choice>
-          <mc:Fallback xmlns:oel="http://schemas.microsoft.com/office/2019/extlst" xmlns:w16du="http://schemas.microsoft.com/office/word/2023/wordml/word16du" xmlns:w16sdtdh="http://schemas.microsoft.com/office/word/2020/wordml/sdtdatahash" xmlns:w16="http://schemas.microsoft.com/office/word/2018/wordml" xmlns:w16cex="http://schemas.microsoft.com/office/word/2018/wordml/cex">
+          <mc:Fallback xmlns:w16cex="http://schemas.microsoft.com/office/word/2018/wordml/cex" xmlns:w16="http://schemas.microsoft.com/office/word/2018/wordml" xmlns:w16sdtdh="http://schemas.microsoft.com/office/word/2020/wordml/sdtdatahash" xmlns:w16du="http://schemas.microsoft.com/office/word/2023/wordml/word16du" xmlns:oel="http://schemas.microsoft.com/office/2019/extlst">
             <w:pict>
               <v:roundrect w14:anchorId="4AE4CB54" id="מלבן מעוגל 1" o:spid="_x0000_s1026" style="width:9.45pt;height:9.45pt;visibility:visible;mso-wrap-style:square;mso-left-percent:-10001;mso-top-percent:-10001;mso-position-horizontal:absolute;mso-position-horizontal-relative:char;mso-position-vertical:absolute;mso-position-vertical-relative:line;mso-left-percent:-10001;mso-top-percent:-10001;v-text-anchor:top" arcsize="10923f" o:gfxdata="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">
                 <o:lock v:ext="edit" aspectratio="t"/>
@@ -4987,6 +4985,345 @@
         </w:rPr>
         <w:br w:type="page"/>
       </w:r>
+      <w:r>
+        <w:rPr>
+          <w:noProof/>
+        </w:rPr>
+        <w:lastRenderedPageBreak/>
+        <w:drawing>
+          <wp:anchor distT="0" distB="0" distL="0" distR="0" simplePos="0" relativeHeight="251660288" behindDoc="0" locked="0" layoutInCell="1" allowOverlap="1" wp14:anchorId="383E5163" wp14:editId="5C3F9761">
+            <wp:simplePos x="0" y="0"/>
+            <wp:positionH relativeFrom="margin">
+              <wp:align>right</wp:align>
+            </wp:positionH>
+            <wp:positionV relativeFrom="paragraph">
+              <wp:posOffset>321310</wp:posOffset>
+            </wp:positionV>
+            <wp:extent cx="5939790" cy="8238490"/>
+            <wp:effectExtent l="0" t="0" r="3810" b="0"/>
+            <wp:wrapTopAndBottom/>
+            <wp:docPr id="13" name="image7.jpeg"/>
+            <wp:cNvGraphicFramePr>
+              <a:graphicFrameLocks xmlns:a="http://schemas.openxmlformats.org/drawingml/2006/main" noChangeAspect="1"/>
+            </wp:cNvGraphicFramePr>
+            <a:graphic xmlns:a="http://schemas.openxmlformats.org/drawingml/2006/main">
+              <a:graphicData uri="http://schemas.openxmlformats.org/drawingml/2006/picture">
+                <pic:pic xmlns:pic="http://schemas.openxmlformats.org/drawingml/2006/picture">
+                  <pic:nvPicPr>
+                    <pic:cNvPr id="6" name="image7.jpeg"/>
+                    <pic:cNvPicPr/>
+                  </pic:nvPicPr>
+                  <pic:blipFill>
+                    <a:blip r:embed="rId6" cstate="print"/>
+                    <a:stretch>
+                      <a:fillRect/>
+                    </a:stretch>
+                  </pic:blipFill>
+                  <pic:spPr>
+                    <a:xfrm>
+                      <a:off x="0" y="0"/>
+                      <a:ext cx="5939790" cy="8238490"/>
+                    </a:xfrm>
+                    <a:prstGeom prst="rect">
+                      <a:avLst/>
+                    </a:prstGeom>
+                  </pic:spPr>
+                </pic:pic>
+              </a:graphicData>
+            </a:graphic>
+            <wp14:sizeRelH relativeFrom="margin">
+              <wp14:pctWidth>0</wp14:pctWidth>
+            </wp14:sizeRelH>
+            <wp14:sizeRelV relativeFrom="margin">
+              <wp14:pctHeight>0</wp14:pctHeight>
+            </wp14:sizeRelV>
+          </wp:anchor>
+        </w:drawing>
+      </w:r>
+      <w:r>
+        <w:rPr>
+          <w:sz w:val="28"/>
+          <w:szCs w:val="28"/>
+          <w:rtl/>
+        </w:rPr>
+        <w:br w:type="page"/>
+      </w:r>
+    </w:p>
+    <w:p>
+      <w:pPr>
+        <w:rPr>
+          <w:sz w:val="28"/>
+          <w:szCs w:val="28"/>
+          <w:rtl/>
+        </w:rPr>
+      </w:pPr>
+      <w:r>
+        <w:rPr>
+          <w:noProof/>
+          <w:sz w:val="28"/>
+          <w:szCs w:val="28"/>
+          <w:rtl/>
+          <w:lang w:val="he-IL"/>
+          <w14:ligatures w14:val="standardContextual"/>
+        </w:rPr>
+        <w:lastRenderedPageBreak/>
+        <mc:AlternateContent>
+          <mc:Choice Requires="wpg">
+            <w:drawing>
+              <wp:anchor distT="0" distB="0" distL="114300" distR="114300" simplePos="0" relativeHeight="251658240" behindDoc="1" locked="0" layoutInCell="1" allowOverlap="1" wp14:editId="20A1B0C3">
+                <wp:simplePos x="0" y="0"/>
+                <wp:positionH relativeFrom="page">
+                  <wp:posOffset>1073785</wp:posOffset>
+                </wp:positionH>
+                <wp:positionV relativeFrom="paragraph">
+                  <wp:posOffset>762635</wp:posOffset>
+                </wp:positionV>
+                <wp:extent cx="5643880" cy="4185920"/>
+                <wp:effectExtent l="0" t="0" r="0" b="0"/>
+                <wp:wrapNone/>
+                <wp:docPr id="7" name="קבוצה 7"/>
+                <wp:cNvGraphicFramePr>
+                  <a:graphicFrameLocks xmlns:a="http://schemas.openxmlformats.org/drawingml/2006/main"/>
+                </wp:cNvGraphicFramePr>
+                <a:graphic xmlns:a="http://schemas.openxmlformats.org/drawingml/2006/main">
+                  <a:graphicData uri="http://schemas.microsoft.com/office/word/2010/wordprocessingGroup">
+                    <wpg:wgp>
+                      <wpg:cNvGrpSpPr>
+                        <a:grpSpLocks/>
+                      </wpg:cNvGrpSpPr>
+                      <wpg:grpSpPr bwMode="auto">
+                        <a:xfrm>
+                          <a:off x="0" y="0"/>
+                          <a:ext cx="5643880" cy="4185920"/>
+                          <a:chOff x="1691" y="121"/>
+                          <a:chExt cx="8888" cy="6592"/>
+                        </a:xfrm>
+                      </wpg:grpSpPr>
+                      <pic:pic xmlns:pic="http://schemas.openxmlformats.org/drawingml/2006/picture">
+                        <pic:nvPicPr>
+                          <pic:cNvPr id="10" name="Picture 3"/>
+                          <pic:cNvPicPr>
+                            <a:picLocks noChangeAspect="1" noChangeArrowheads="1"/>
+                          </pic:cNvPicPr>
+                        </pic:nvPicPr>
+                        <pic:blipFill>
+                          <a:blip r:embed="rId7">
+                            <a:extLst>
+                              <a:ext uri="{28A0092B-C50C-407E-A947-70E740481C1C}">
+                                <a14:useLocalDpi xmlns:a14="http://schemas.microsoft.com/office/drawing/2010/main" val="0"/>
+                              </a:ext>
+                            </a:extLst>
+                          </a:blip>
+                          <a:srcRect/>
+                          <a:stretch>
+                            <a:fillRect/>
+                          </a:stretch>
+                        </pic:blipFill>
+                        <pic:spPr bwMode="auto">
+                          <a:xfrm>
+                            <a:off x="1691" y="121"/>
+                            <a:ext cx="8888" cy="6592"/>
+                          </a:xfrm>
+                          <a:prstGeom prst="rect">
+                            <a:avLst/>
+                          </a:prstGeom>
+                          <a:noFill/>
+                          <a:ln>
+                            <a:noFill/>
+                          </a:ln>
+                          <a:extLst>
+                            <a:ext uri="{909E8E84-426E-40DD-AFC4-6F175D3DCCD1}">
+                              <a14:hiddenFill xmlns:a14="http://schemas.microsoft.com/office/drawing/2010/main">
+                                <a:solidFill>
+                                  <a:srgbClr val="FFFFFF"/>
+                                </a:solidFill>
+                              </a14:hiddenFill>
+                            </a:ext>
+                            <a:ext uri="{91240B29-F687-4F45-9708-019B960494DF}">
+                              <a14:hiddenLine xmlns:a14="http://schemas.microsoft.com/office/drawing/2010/main" w="9525">
+                                <a:solidFill>
+                                  <a:srgbClr val="000000"/>
+                                </a:solidFill>
+                                <a:miter lim="800000"/>
+                                <a:headEnd/>
+                                <a:tailEnd/>
+                              </a14:hiddenLine>
+                            </a:ext>
+                          </a:extLst>
+                        </pic:spPr>
+                      </pic:pic>
+                      <pic:pic xmlns:pic="http://schemas.openxmlformats.org/drawingml/2006/picture">
+                        <pic:nvPicPr>
+                          <pic:cNvPr id="11" name="Picture 4"/>
+                          <pic:cNvPicPr>
+                            <a:picLocks noChangeAspect="1" noChangeArrowheads="1"/>
+                          </pic:cNvPicPr>
+                        </pic:nvPicPr>
+                        <pic:blipFill>
+                          <a:blip r:embed="rId8">
+                            <a:extLst>
+                              <a:ext uri="{28A0092B-C50C-407E-A947-70E740481C1C}">
+                                <a14:useLocalDpi xmlns:a14="http://schemas.microsoft.com/office/drawing/2010/main" val="0"/>
+                              </a:ext>
+                            </a:extLst>
+                          </a:blip>
+                          <a:srcRect/>
+                          <a:stretch>
+                            <a:fillRect/>
+                          </a:stretch>
+                        </pic:blipFill>
+                        <pic:spPr bwMode="auto">
+                          <a:xfrm>
+                            <a:off x="2746" y="2035"/>
+                            <a:ext cx="10" cy="86"/>
+                          </a:xfrm>
+                          <a:prstGeom prst="rect">
+                            <a:avLst/>
+                          </a:prstGeom>
+                          <a:noFill/>
+                          <a:ln>
+                            <a:noFill/>
+                          </a:ln>
+                          <a:extLst>
+                            <a:ext uri="{909E8E84-426E-40DD-AFC4-6F175D3DCCD1}">
+                              <a14:hiddenFill xmlns:a14="http://schemas.microsoft.com/office/drawing/2010/main">
+                                <a:solidFill>
+                                  <a:srgbClr val="FFFFFF"/>
+                                </a:solidFill>
+                              </a14:hiddenFill>
+                            </a:ext>
+                            <a:ext uri="{91240B29-F687-4F45-9708-019B960494DF}">
+                              <a14:hiddenLine xmlns:a14="http://schemas.microsoft.com/office/drawing/2010/main" w="9525">
+                                <a:solidFill>
+                                  <a:srgbClr val="000000"/>
+                                </a:solidFill>
+                                <a:miter lim="800000"/>
+                                <a:headEnd/>
+                                <a:tailEnd/>
+                              </a14:hiddenLine>
+                            </a:ext>
+                          </a:extLst>
+                        </pic:spPr>
+                      </pic:pic>
+                      <pic:pic xmlns:pic="http://schemas.openxmlformats.org/drawingml/2006/picture">
+                        <pic:nvPicPr>
+                          <pic:cNvPr id="12" name="Picture 5"/>
+                          <pic:cNvPicPr>
+                            <a:picLocks noChangeAspect="1" noChangeArrowheads="1"/>
+                          </pic:cNvPicPr>
+                        </pic:nvPicPr>
+                        <pic:blipFill>
+                          <a:blip r:embed="rId8">
+                            <a:extLst>
+                              <a:ext uri="{28A0092B-C50C-407E-A947-70E740481C1C}">
+                                <a14:useLocalDpi xmlns:a14="http://schemas.microsoft.com/office/drawing/2010/main" val="0"/>
+                              </a:ext>
+                            </a:extLst>
+                          </a:blip>
+                          <a:srcRect/>
+                          <a:stretch>
+                            <a:fillRect/>
+                          </a:stretch>
+                        </pic:blipFill>
+                        <pic:spPr bwMode="auto">
+                          <a:xfrm>
+                            <a:off x="2746" y="1748"/>
+                            <a:ext cx="10" cy="87"/>
+                          </a:xfrm>
+                          <a:prstGeom prst="rect">
+                            <a:avLst/>
+                          </a:prstGeom>
+                          <a:noFill/>
+                          <a:ln>
+                            <a:noFill/>
+                          </a:ln>
+                          <a:extLst>
+                            <a:ext uri="{909E8E84-426E-40DD-AFC4-6F175D3DCCD1}">
+                              <a14:hiddenFill xmlns:a14="http://schemas.microsoft.com/office/drawing/2010/main">
+                                <a:solidFill>
+                                  <a:srgbClr val="FFFFFF"/>
+                                </a:solidFill>
+                              </a14:hiddenFill>
+                            </a:ext>
+                            <a:ext uri="{91240B29-F687-4F45-9708-019B960494DF}">
+                              <a14:hiddenLine xmlns:a14="http://schemas.microsoft.com/office/drawing/2010/main" w="9525">
+                                <a:solidFill>
+                                  <a:srgbClr val="000000"/>
+                                </a:solidFill>
+                                <a:miter lim="800000"/>
+                                <a:headEnd/>
+                                <a:tailEnd/>
+                              </a14:hiddenLine>
+                            </a:ext>
+                          </a:extLst>
+                        </pic:spPr>
+                      </pic:pic>
+                    </wpg:wgp>
+                  </a:graphicData>
+                </a:graphic>
+                <wp14:sizeRelH relativeFrom="page">
+                  <wp14:pctWidth>0</wp14:pctWidth>
+                </wp14:sizeRelH>
+                <wp14:sizeRelV relativeFrom="page">
+                  <wp14:pctHeight>0</wp14:pctHeight>
+                </wp14:sizeRelV>
+              </wp:anchor>
+            </w:drawing>
+          </mc:Choice>
+          <mc:Fallback>
+            <w:pict>
+              <v:group w14:anchorId="4F30BBCA" id="קבוצה 7" o:spid="_x0000_s1026" style="position:absolute;left:0;text-align:left;margin-left:84.55pt;margin-top:60.05pt;width:444.4pt;height:329.6pt;z-index:-251658240;mso-position-horizontal-relative:page" coordorigin="1691,121" coordsize="8888,6592" o:gfxdata="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">
+                <v:shapetype id="_x0000_t75" coordsize="21600,21600" o:spt="75" o:preferrelative="t" path="m@4@5l@4@11@9@11@9@5xe" filled="f" stroked="f">
+                  <v:stroke joinstyle="miter"/>
+                  <v:formulas>
+                    <v:f eqn="if lineDrawn pixelLineWidth 0"/>
+                    <v:f eqn="sum @0 1 0"/>
+                    <v:f eqn="sum 0 0 @1"/>
+                    <v:f eqn="prod @2 1 2"/>
+                    <v:f eqn="prod @3 21600 pixelWidth"/>
+                    <v:f eqn="prod @3 21600 pixelHeight"/>
+                    <v:f eqn="sum @0 0 1"/>
+                    <v:f eqn="prod @6 1 2"/>
+                    <v:f eqn="prod @7 21600 pixelWidth"/>
+                    <v:f eqn="sum @8 21600 0"/>
+                    <v:f eqn="prod @7 21600 pixelHeight"/>
+                    <v:f eqn="sum @10 21600 0"/>
+                  </v:formulas>
+                  <v:path o:extrusionok="f" gradientshapeok="t" o:connecttype="rect"/>
+                  <o:lock v:ext="edit" aspectratio="t"/>
+                </v:shapetype>
+                <v:shape id="Picture 3" o:spid="_x0000_s1027" type="#_x0000_t75" style="position:absolute;left:1691;top:121;width:8888;height:6592;visibility:visible;mso-wrap-style:square" o:gfxdata="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">
+                  <v:imagedata r:id="rId9" o:title=""/>
+                </v:shape>
+                <v:shape id="Picture 4" o:spid="_x0000_s1028" type="#_x0000_t75" style="position:absolute;left:2746;top:2035;width:10;height:86;visibility:visible;mso-wrap-style:square" o:gfxdata="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">
+                  <v:imagedata r:id="rId10" o:title=""/>
+                </v:shape>
+                <v:shape id="Picture 5" o:spid="_x0000_s1029" type="#_x0000_t75" style="position:absolute;left:2746;top:1748;width:10;height:87;visibility:visible;mso-wrap-style:square" o:gfxdata="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">
+                  <v:imagedata r:id="rId10" o:title=""/>
+                </v:shape>
+                <w10:wrap anchorx="page"/>
+              </v:group>
+            </w:pict>
+          </mc:Fallback>
+        </mc:AlternateContent>
+      </w:r>
+      <w:r>
+        <w:rPr>
+          <w:sz w:val="28"/>
+          <w:szCs w:val="28"/>
+          <w:rtl/>
+        </w:rPr>
+        <w:br w:type="page"/>
+      </w:r>
+    </w:p>
+    <w:p>
+      <w:pPr>
+        <w:rPr>
+          <w:sz w:val="28"/>
+          <w:szCs w:val="28"/>
+          <w:rtl/>
+        </w:rPr>
+      </w:pPr>
     </w:p>
     <w:p>
       <w:pPr>
@@ -5004,7 +5341,6 @@
           <w:szCs w:val="28"/>
           <w:rtl/>
         </w:rPr>
-        <w:lastRenderedPageBreak/>
         <w:t xml:space="preserve">מכונית </w:t>
       </w:r>
       <w:r>
@@ -5048,7 +5384,7 @@
                     <pic:cNvPicPr/>
                   </pic:nvPicPr>
                   <pic:blipFill rotWithShape="1">
-                    <a:blip r:embed="rId6"/>
+                    <a:blip r:embed="rId11"/>
                     <a:srcRect b="1103"/>
                     <a:stretch/>
                   </pic:blipFill>
@@ -5088,13 +5424,20 @@
     </w:p>
     <w:p>
       <w:pPr>
-        <w:jc w:val="center"/>
         <w:rPr>
           <w:sz w:val="28"/>
           <w:szCs w:val="28"/>
           <w:rtl/>
         </w:rPr>
       </w:pPr>
+      <w:r>
+        <w:rPr>
+          <w:sz w:val="28"/>
+          <w:szCs w:val="28"/>
+          <w:rtl/>
+        </w:rPr>
+        <w:br w:type="page"/>
+      </w:r>
     </w:p>
     <w:p>
       <w:pPr>
@@ -5105,46 +5448,247 @@
           <w:rtl/>
         </w:rPr>
       </w:pPr>
+      <w:r>
+        <w:rPr>
+          <w:noProof/>
+        </w:rPr>
+        <w:lastRenderedPageBreak/>
+        <w:drawing>
+          <wp:anchor distT="0" distB="0" distL="0" distR="0" simplePos="0" relativeHeight="251662336" behindDoc="0" locked="0" layoutInCell="1" allowOverlap="1" wp14:anchorId="551E1824" wp14:editId="06359E6E">
+            <wp:simplePos x="0" y="0"/>
+            <wp:positionH relativeFrom="margin">
+              <wp:align>right</wp:align>
+            </wp:positionH>
+            <wp:positionV relativeFrom="paragraph">
+              <wp:posOffset>634</wp:posOffset>
+            </wp:positionV>
+            <wp:extent cx="5939155" cy="9257255"/>
+            <wp:effectExtent l="0" t="0" r="4445" b="1270"/>
+            <wp:wrapTopAndBottom/>
+            <wp:docPr id="14" name="image11.jpeg"/>
+            <wp:cNvGraphicFramePr>
+              <a:graphicFrameLocks xmlns:a="http://schemas.openxmlformats.org/drawingml/2006/main" noChangeAspect="1"/>
+            </wp:cNvGraphicFramePr>
+            <a:graphic xmlns:a="http://schemas.openxmlformats.org/drawingml/2006/main">
+              <a:graphicData uri="http://schemas.openxmlformats.org/drawingml/2006/picture">
+                <pic:pic xmlns:pic="http://schemas.openxmlformats.org/drawingml/2006/picture">
+                  <pic:nvPicPr>
+                    <pic:cNvPr id="10" name="image11.jpeg"/>
+                    <pic:cNvPicPr/>
+                  </pic:nvPicPr>
+                  <pic:blipFill>
+                    <a:blip r:embed="rId12" cstate="print"/>
+                    <a:stretch>
+                      <a:fillRect/>
+                    </a:stretch>
+                  </pic:blipFill>
+                  <pic:spPr>
+                    <a:xfrm>
+                      <a:off x="0" y="0"/>
+                      <a:ext cx="5939155" cy="9257255"/>
+                    </a:xfrm>
+                    <a:prstGeom prst="rect">
+                      <a:avLst/>
+                    </a:prstGeom>
+                  </pic:spPr>
+                </pic:pic>
+              </a:graphicData>
+            </a:graphic>
+            <wp14:sizeRelH relativeFrom="margin">
+              <wp14:pctWidth>0</wp14:pctWidth>
+            </wp14:sizeRelH>
+            <wp14:sizeRelV relativeFrom="margin">
+              <wp14:pctHeight>0</wp14:pctHeight>
+            </wp14:sizeRelV>
+          </wp:anchor>
+        </w:drawing>
+      </w:r>
     </w:p>
     <w:p>
       <w:pPr>
-        <w:jc w:val="center"/>
         <w:rPr>
           <w:sz w:val="28"/>
           <w:szCs w:val="28"/>
           <w:rtl/>
         </w:rPr>
       </w:pPr>
-    </w:p>
-    <w:p>
-      <w:pPr>
-        <w:jc w:val="center"/>
-        <w:rPr>
+      <w:r>
+        <w:rPr>
+          <w:noProof/>
           <w:sz w:val="28"/>
           <w:szCs w:val="28"/>
           <w:rtl/>
-        </w:rPr>
-      </w:pPr>
-    </w:p>
-    <w:p>
-      <w:pPr>
-        <w:jc w:val="center"/>
-        <w:rPr>
-          <w:sz w:val="28"/>
-          <w:szCs w:val="28"/>
-          <w:rtl/>
-        </w:rPr>
-      </w:pPr>
-    </w:p>
-    <w:p>
-      <w:pPr>
-        <w:jc w:val="center"/>
-        <w:rPr>
-          <w:sz w:val="28"/>
-          <w:szCs w:val="28"/>
-          <w:rtl/>
-        </w:rPr>
-      </w:pPr>
+          <w:lang w:val="he-IL"/>
+          <w14:ligatures w14:val="standardContextual"/>
+        </w:rPr>
+        <w:lastRenderedPageBreak/>
+        <mc:AlternateContent>
+          <mc:Choice Requires="wpg">
+            <w:drawing>
+              <wp:anchor distT="0" distB="0" distL="114300" distR="114300" simplePos="0" relativeHeight="251663360" behindDoc="1" locked="0" layoutInCell="1" allowOverlap="1" wp14:editId="610BA05D">
+                <wp:simplePos x="0" y="0"/>
+                <wp:positionH relativeFrom="page">
+                  <wp:posOffset>1073785</wp:posOffset>
+                </wp:positionH>
+                <wp:positionV relativeFrom="paragraph">
+                  <wp:posOffset>1178560</wp:posOffset>
+                </wp:positionV>
+                <wp:extent cx="5643880" cy="4079875"/>
+                <wp:effectExtent l="0" t="0" r="0" b="0"/>
+                <wp:wrapNone/>
+                <wp:docPr id="15" name="קבוצה 15"/>
+                <wp:cNvGraphicFramePr>
+                  <a:graphicFrameLocks xmlns:a="http://schemas.openxmlformats.org/drawingml/2006/main"/>
+                </wp:cNvGraphicFramePr>
+                <a:graphic xmlns:a="http://schemas.openxmlformats.org/drawingml/2006/main">
+                  <a:graphicData uri="http://schemas.microsoft.com/office/word/2010/wordprocessingGroup">
+                    <wpg:wgp>
+                      <wpg:cNvGrpSpPr>
+                        <a:grpSpLocks/>
+                      </wpg:cNvGrpSpPr>
+                      <wpg:grpSpPr bwMode="auto">
+                        <a:xfrm>
+                          <a:off x="0" y="0"/>
+                          <a:ext cx="5643880" cy="4079875"/>
+                          <a:chOff x="1691" y="73"/>
+                          <a:chExt cx="8888" cy="6425"/>
+                        </a:xfrm>
+                      </wpg:grpSpPr>
+                      <pic:pic xmlns:pic="http://schemas.openxmlformats.org/drawingml/2006/picture">
+                        <pic:nvPicPr>
+                          <pic:cNvPr id="16" name="Picture 7"/>
+                          <pic:cNvPicPr>
+                            <a:picLocks noChangeAspect="1" noChangeArrowheads="1"/>
+                          </pic:cNvPicPr>
+                        </pic:nvPicPr>
+                        <pic:blipFill>
+                          <a:blip r:embed="rId13">
+                            <a:extLst>
+                              <a:ext uri="{28A0092B-C50C-407E-A947-70E740481C1C}">
+                                <a14:useLocalDpi xmlns:a14="http://schemas.microsoft.com/office/drawing/2010/main" val="0"/>
+                              </a:ext>
+                            </a:extLst>
+                          </a:blip>
+                          <a:srcRect/>
+                          <a:stretch>
+                            <a:fillRect/>
+                          </a:stretch>
+                        </pic:blipFill>
+                        <pic:spPr bwMode="auto">
+                          <a:xfrm>
+                            <a:off x="1691" y="73"/>
+                            <a:ext cx="8888" cy="6425"/>
+                          </a:xfrm>
+                          <a:prstGeom prst="rect">
+                            <a:avLst/>
+                          </a:prstGeom>
+                          <a:noFill/>
+                          <a:ln>
+                            <a:noFill/>
+                          </a:ln>
+                          <a:extLst>
+                            <a:ext uri="{909E8E84-426E-40DD-AFC4-6F175D3DCCD1}">
+                              <a14:hiddenFill xmlns:a14="http://schemas.microsoft.com/office/drawing/2010/main">
+                                <a:solidFill>
+                                  <a:srgbClr val="FFFFFF"/>
+                                </a:solidFill>
+                              </a14:hiddenFill>
+                            </a:ext>
+                            <a:ext uri="{91240B29-F687-4F45-9708-019B960494DF}">
+                              <a14:hiddenLine xmlns:a14="http://schemas.microsoft.com/office/drawing/2010/main" w="9525">
+                                <a:solidFill>
+                                  <a:srgbClr val="000000"/>
+                                </a:solidFill>
+                                <a:miter lim="800000"/>
+                                <a:headEnd/>
+                                <a:tailEnd/>
+                              </a14:hiddenLine>
+                            </a:ext>
+                          </a:extLst>
+                        </pic:spPr>
+                      </pic:pic>
+                      <pic:pic xmlns:pic="http://schemas.openxmlformats.org/drawingml/2006/picture">
+                        <pic:nvPicPr>
+                          <pic:cNvPr id="17" name="Picture 8"/>
+                          <pic:cNvPicPr>
+                            <a:picLocks noChangeAspect="1" noChangeArrowheads="1"/>
+                          </pic:cNvPicPr>
+                        </pic:nvPicPr>
+                        <pic:blipFill>
+                          <a:blip r:embed="rId8">
+                            <a:extLst>
+                              <a:ext uri="{28A0092B-C50C-407E-A947-70E740481C1C}">
+                                <a14:useLocalDpi xmlns:a14="http://schemas.microsoft.com/office/drawing/2010/main" val="0"/>
+                              </a:ext>
+                            </a:extLst>
+                          </a:blip>
+                          <a:srcRect/>
+                          <a:stretch>
+                            <a:fillRect/>
+                          </a:stretch>
+                        </pic:blipFill>
+                        <pic:spPr bwMode="auto">
+                          <a:xfrm>
+                            <a:off x="2746" y="1820"/>
+                            <a:ext cx="10" cy="86"/>
+                          </a:xfrm>
+                          <a:prstGeom prst="rect">
+                            <a:avLst/>
+                          </a:prstGeom>
+                          <a:noFill/>
+                          <a:ln>
+                            <a:noFill/>
+                          </a:ln>
+                          <a:extLst>
+                            <a:ext uri="{909E8E84-426E-40DD-AFC4-6F175D3DCCD1}">
+                              <a14:hiddenFill xmlns:a14="http://schemas.microsoft.com/office/drawing/2010/main">
+                                <a:solidFill>
+                                  <a:srgbClr val="FFFFFF"/>
+                                </a:solidFill>
+                              </a14:hiddenFill>
+                            </a:ext>
+                            <a:ext uri="{91240B29-F687-4F45-9708-019B960494DF}">
+                              <a14:hiddenLine xmlns:a14="http://schemas.microsoft.com/office/drawing/2010/main" w="9525">
+                                <a:solidFill>
+                                  <a:srgbClr val="000000"/>
+                                </a:solidFill>
+                                <a:miter lim="800000"/>
+                                <a:headEnd/>
+                                <a:tailEnd/>
+                              </a14:hiddenLine>
+                            </a:ext>
+                          </a:extLst>
+                        </pic:spPr>
+                      </pic:pic>
+                    </wpg:wgp>
+                  </a:graphicData>
+                </a:graphic>
+                <wp14:sizeRelH relativeFrom="page">
+                  <wp14:pctWidth>0</wp14:pctWidth>
+                </wp14:sizeRelH>
+                <wp14:sizeRelV relativeFrom="page">
+                  <wp14:pctHeight>0</wp14:pctHeight>
+                </wp14:sizeRelV>
+              </wp:anchor>
+            </w:drawing>
+          </mc:Choice>
+          <mc:Fallback>
+            <w:pict>
+              <v:group w14:anchorId="48F2A40B" id="קבוצה 15" o:spid="_x0000_s1026" style="position:absolute;left:0;text-align:left;margin-left:84.55pt;margin-top:92.8pt;width:444.4pt;height:321.25pt;z-index:-251653120;mso-position-horizontal-relative:page" coordorigin="1691,73" coordsize="8888,6425" o:gfxdata="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">
+                <v:shape id="Picture 7" o:spid="_x0000_s1027" type="#_x0000_t75" style="position:absolute;left:1691;top:73;width:8888;height:6425;visibility:visible;mso-wrap-style:square" o:gfxdata="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">
+                  <v:imagedata r:id="rId14" o:title=""/>
+                </v:shape>
+                <v:shape id="Picture 8" o:spid="_x0000_s1028" type="#_x0000_t75" style="position:absolute;left:2746;top:1820;width:10;height:86;visibility:visible;mso-wrap-style:square" o:gfxdata="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">
+                  <v:imagedata r:id="rId10" o:title=""/>
+                </v:shape>
+                <w10:wrap anchorx="page"/>
+              </v:group>
+            </w:pict>
+          </mc:Fallback>
+        </mc:AlternateContent>
+      </w:r>
+      <w:bookmarkStart w:id="2" w:name="_GoBack"/>
+      <w:bookmarkEnd w:id="2"/>
     </w:p>
     <w:p>
       <w:pPr>

</xml_diff>

<commit_message>
added to the new haza according to the new requrments
</commit_message>
<xml_diff>
--- a/הצעת פרוייקט מעודכנת.docx
+++ b/הצעת פרוייקט מעודכנת.docx
@@ -1,7 +1,27 @@
 
 <file path=word/document.xml><?xml version="1.0" encoding="utf-8"?>
-<w:document xmlns:wpc="http://schemas.microsoft.com/office/word/2010/wordprocessingCanvas" xmlns:cx="http://schemas.microsoft.com/office/drawing/2014/chartex" xmlns:cx1="http://schemas.microsoft.com/office/drawing/2015/9/8/chartex" xmlns:cx2="http://schemas.microsoft.com/office/drawing/2015/10/21/chartex" xmlns:cx3="http://schemas.microsoft.com/office/drawing/2016/5/9/chartex" xmlns:cx4="http://schemas.microsoft.com/office/drawing/2016/5/10/chartex" xmlns:cx5="http://schemas.microsoft.com/office/drawing/2016/5/11/chartex" xmlns:cx6="http://schemas.microsoft.com/office/drawing/2016/5/12/chartex" xmlns:cx7="http://schemas.microsoft.com/office/drawing/2016/5/13/chartex" xmlns:cx8="http://schemas.microsoft.com/office/drawing/2016/5/14/chartex" xmlns:mc="http://schemas.openxmlformats.org/markup-compatibility/2006" xmlns:aink="http://schemas.microsoft.com/office/drawing/2016/ink" xmlns:am3d="http://schemas.microsoft.com/office/drawing/2017/model3d" xmlns:o="urn:schemas-microsoft-com:office:office" xmlns:r="http://schemas.openxmlformats.org/officeDocument/2006/relationships" xmlns:m="http://schemas.openxmlformats.org/officeDocument/2006/math" xmlns:v="urn:schemas-microsoft-com:vml" xmlns:wp14="http://schemas.microsoft.com/office/word/2010/wordprocessingDrawing" xmlns:wp="http://schemas.openxmlformats.org/drawingml/2006/wordprocessingDrawing" xmlns:w10="urn:schemas-microsoft-com:office:word" xmlns:w="http://schemas.openxmlformats.org/wordprocessingml/2006/main" xmlns:w14="http://schemas.microsoft.com/office/word/2010/wordml" xmlns:w15="http://schemas.microsoft.com/office/word/2012/wordml" xmlns:w16cid="http://schemas.microsoft.com/office/word/2016/wordml/cid" xmlns:w16se="http://schemas.microsoft.com/office/word/2015/wordml/symex" xmlns:wpg="http://schemas.microsoft.com/office/word/2010/wordprocessingGroup" xmlns:wpi="http://schemas.microsoft.com/office/word/2010/wordprocessingInk" xmlns:wne="http://schemas.microsoft.com/office/word/2006/wordml" xmlns:wps="http://schemas.microsoft.com/office/word/2010/wordprocessingShape" mc:Ignorable="w14 w15 w16se w16cid wp14">
+<w:document xmlns:wpc="http://schemas.microsoft.com/office/word/2010/wordprocessingCanvas" xmlns:cx="http://schemas.microsoft.com/office/drawing/2014/chartex" xmlns:cx1="http://schemas.microsoft.com/office/drawing/2015/9/8/chartex" xmlns:cx2="http://schemas.microsoft.com/office/drawing/2015/10/21/chartex" xmlns:cx3="http://schemas.microsoft.com/office/drawing/2016/5/9/chartex" xmlns:cx4="http://schemas.microsoft.com/office/drawing/2016/5/10/chartex" xmlns:cx5="http://schemas.microsoft.com/office/drawing/2016/5/11/chartex" xmlns:cx6="http://schemas.microsoft.com/office/drawing/2016/5/12/chartex" xmlns:cx7="http://schemas.microsoft.com/office/drawing/2016/5/13/chartex" xmlns:cx8="http://schemas.microsoft.com/office/drawing/2016/5/14/chartex" xmlns:mc="http://schemas.openxmlformats.org/markup-compatibility/2006" xmlns:aink="http://schemas.microsoft.com/office/drawing/2016/ink" xmlns:am3d="http://schemas.microsoft.com/office/drawing/2017/model3d" xmlns:o="urn:schemas-microsoft-com:office:office" xmlns:oel="http://schemas.microsoft.com/office/2019/extlst" xmlns:r="http://schemas.openxmlformats.org/officeDocument/2006/relationships" xmlns:m="http://schemas.openxmlformats.org/officeDocument/2006/math" xmlns:v="urn:schemas-microsoft-com:vml" xmlns:wp14="http://schemas.microsoft.com/office/word/2010/wordprocessingDrawing" xmlns:wp="http://schemas.openxmlformats.org/drawingml/2006/wordprocessingDrawing" xmlns:w10="urn:schemas-microsoft-com:office:word" xmlns:w="http://schemas.openxmlformats.org/wordprocessingml/2006/main" xmlns:w14="http://schemas.microsoft.com/office/word/2010/wordml" xmlns:w15="http://schemas.microsoft.com/office/word/2012/wordml" xmlns:w16cex="http://schemas.microsoft.com/office/word/2018/wordml/cex" xmlns:w16cid="http://schemas.microsoft.com/office/word/2016/wordml/cid" xmlns:w16="http://schemas.microsoft.com/office/word/2018/wordml" xmlns:w16du="http://schemas.microsoft.com/office/word/2023/wordml/word16du" xmlns:w16sdtdh="http://schemas.microsoft.com/office/word/2020/wordml/sdtdatahash" xmlns:w16se="http://schemas.microsoft.com/office/word/2015/wordml/symex" xmlns:wpg="http://schemas.microsoft.com/office/word/2010/wordprocessingGroup" xmlns:wpi="http://schemas.microsoft.com/office/word/2010/wordprocessingInk" xmlns:wne="http://schemas.microsoft.com/office/word/2006/wordml" xmlns:wps="http://schemas.microsoft.com/office/word/2010/wordprocessingShape" mc:Ignorable="w14 w15 w16se w16cid w16 w16cex w16sdtdh w16du wp14">
   <w:body>
+    <w:p>
+      <w:pPr>
+        <w:rPr>
+          <w:rFonts w:asciiTheme="majorHAnsi" w:eastAsiaTheme="majorEastAsia" w:hAnsiTheme="majorHAnsi" w:cstheme="majorBidi"/>
+          <w:sz w:val="56"/>
+          <w:szCs w:val="56"/>
+          <w:rtl/>
+        </w:rPr>
+      </w:pPr>
+      <w:bookmarkStart w:id="0" w:name="_Toc167373384"/>
+      <w:bookmarkStart w:id="1" w:name="_Toc167374272"/>
+      <w:r>
+        <w:rPr>
+          <w:sz w:val="56"/>
+          <w:szCs w:val="56"/>
+          <w:rtl/>
+        </w:rPr>
+        <w:br w:type="page"/>
+      </w:r>
+    </w:p>
     <w:p>
       <w:pPr>
         <w:pStyle w:val="1"/>
@@ -13,8 +33,6 @@
           <w:rtl/>
         </w:rPr>
       </w:pPr>
-      <w:bookmarkStart w:id="0" w:name="_Toc167373384"/>
-      <w:bookmarkStart w:id="1" w:name="_Toc167374272"/>
       <w:r>
         <w:rPr>
           <w:rFonts w:hint="cs"/>
@@ -23,6 +41,7 @@
           <w:szCs w:val="56"/>
           <w:rtl/>
         </w:rPr>
+        <w:lastRenderedPageBreak/>
         <w:t>הצעת פרויקט:</w:t>
       </w:r>
       <w:bookmarkEnd w:id="0"/>
@@ -530,7 +549,7 @@
               </wp:inline>
             </w:drawing>
           </mc:Choice>
-          <mc:Fallback xmlns:w16cex="http://schemas.microsoft.com/office/word/2018/wordml/cex" xmlns:w16="http://schemas.microsoft.com/office/word/2018/wordml" xmlns:w16sdtdh="http://schemas.microsoft.com/office/word/2020/wordml/sdtdatahash" xmlns:w16du="http://schemas.microsoft.com/office/word/2023/wordml/word16du" xmlns:oel="http://schemas.microsoft.com/office/2019/extlst">
+          <mc:Fallback>
             <w:pict>
               <v:roundrect w14:anchorId="17ED87AC" id="מלבן מעוגל 6" o:spid="_x0000_s1026" style="width:9.45pt;height:9.45pt;visibility:visible;mso-wrap-style:square;mso-left-percent:-10001;mso-top-percent:-10001;mso-position-horizontal:absolute;mso-position-horizontal-relative:char;mso-position-vertical:absolute;mso-position-vertical-relative:line;mso-left-percent:-10001;mso-top-percent:-10001;v-text-anchor:top" arcsize="10923f" o:gfxdata="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" fillcolor="#a8d08d">
                 <o:lock v:ext="edit" aspectratio="t"/>
@@ -666,7 +685,7 @@
               </wp:inline>
             </w:drawing>
           </mc:Choice>
-          <mc:Fallback xmlns:w16cex="http://schemas.microsoft.com/office/word/2018/wordml/cex" xmlns:w16="http://schemas.microsoft.com/office/word/2018/wordml" xmlns:w16sdtdh="http://schemas.microsoft.com/office/word/2020/wordml/sdtdatahash" xmlns:w16du="http://schemas.microsoft.com/office/word/2023/wordml/word16du" xmlns:oel="http://schemas.microsoft.com/office/2019/extlst">
+          <mc:Fallback>
             <w:pict>
               <v:roundrect w14:anchorId="075500E5" id="מלבן מעוגל 5" o:spid="_x0000_s1026" style="width:9.45pt;height:9.45pt;visibility:visible;mso-wrap-style:square;mso-left-percent:-10001;mso-top-percent:-10001;mso-position-horizontal:absolute;mso-position-horizontal-relative:char;mso-position-vertical:absolute;mso-position-vertical-relative:line;mso-left-percent:-10001;mso-top-percent:-10001;v-text-anchor:top" arcsize="10923f" o:gfxdata="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">
                 <o:lock v:ext="edit" aspectratio="t"/>
@@ -3190,25 +3209,7 @@
           <w:rtl/>
         </w:rPr>
         <w:lastRenderedPageBreak/>
-        <w:t xml:space="preserve">7. כתיבת </w:t>
-      </w:r>
-      <w:proofErr w:type="spellStart"/>
-      <w:r>
-        <w:rPr>
-          <w:rFonts w:cs="Arial" w:hint="cs"/>
-          <w:u w:val="single"/>
-          <w:rtl/>
-        </w:rPr>
-        <w:t>תוכנית</w:t>
-      </w:r>
-      <w:proofErr w:type="spellEnd"/>
-      <w:r>
-        <w:rPr>
-          <w:rFonts w:cs="Arial" w:hint="cs"/>
-          <w:u w:val="single"/>
-          <w:rtl/>
-        </w:rPr>
-        <w:t xml:space="preserve"> בשפת </w:t>
+        <w:t xml:space="preserve">7. כתיבת תוכנית בשפת </w:t>
       </w:r>
       <w:r>
         <w:rPr>
@@ -4330,7 +4331,7 @@
               </wp:inline>
             </w:drawing>
           </mc:Choice>
-          <mc:Fallback xmlns:w16cex="http://schemas.microsoft.com/office/word/2018/wordml/cex" xmlns:w16="http://schemas.microsoft.com/office/word/2018/wordml" xmlns:w16sdtdh="http://schemas.microsoft.com/office/word/2020/wordml/sdtdatahash" xmlns:w16du="http://schemas.microsoft.com/office/word/2023/wordml/word16du" xmlns:oel="http://schemas.microsoft.com/office/2019/extlst">
+          <mc:Fallback>
             <w:pict>
               <v:roundrect w14:anchorId="1D42CF48" id="מלבן מעוגל 4" o:spid="_x0000_s1026" style="width:9.45pt;height:9.45pt;visibility:visible;mso-wrap-style:square;mso-left-percent:-10001;mso-top-percent:-10001;mso-position-horizontal:absolute;mso-position-horizontal-relative:char;mso-position-vertical:absolute;mso-position-vertical-relative:line;mso-left-percent:-10001;mso-top-percent:-10001;v-text-anchor:top" arcsize="10923f" o:gfxdata="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">
                 <o:lock v:ext="edit" aspectratio="t"/>
@@ -4417,7 +4418,7 @@
               </wp:inline>
             </w:drawing>
           </mc:Choice>
-          <mc:Fallback xmlns:w16cex="http://schemas.microsoft.com/office/word/2018/wordml/cex" xmlns:w16="http://schemas.microsoft.com/office/word/2018/wordml" xmlns:w16sdtdh="http://schemas.microsoft.com/office/word/2020/wordml/sdtdatahash" xmlns:w16du="http://schemas.microsoft.com/office/word/2023/wordml/word16du" xmlns:oel="http://schemas.microsoft.com/office/2019/extlst">
+          <mc:Fallback>
             <w:pict>
               <v:roundrect w14:anchorId="070688B8" id="מלבן מעוגל 3" o:spid="_x0000_s1026" style="width:9.45pt;height:9.45pt;visibility:visible;mso-wrap-style:square;mso-left-percent:-10001;mso-top-percent:-10001;mso-position-horizontal:absolute;mso-position-horizontal-relative:char;mso-position-vertical:absolute;mso-position-vertical-relative:line;mso-left-percent:-10001;mso-top-percent:-10001;v-text-anchor:top" arcsize="10923f" o:gfxdata="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">
                 <o:lock v:ext="edit" aspectratio="t"/>
@@ -4550,7 +4551,7 @@
               </wp:inline>
             </w:drawing>
           </mc:Choice>
-          <mc:Fallback xmlns:w16cex="http://schemas.microsoft.com/office/word/2018/wordml/cex" xmlns:w16="http://schemas.microsoft.com/office/word/2018/wordml" xmlns:w16sdtdh="http://schemas.microsoft.com/office/word/2020/wordml/sdtdatahash" xmlns:w16du="http://schemas.microsoft.com/office/word/2023/wordml/word16du" xmlns:oel="http://schemas.microsoft.com/office/2019/extlst">
+          <mc:Fallback>
             <w:pict>
               <v:roundrect w14:anchorId="10070B32" id="מלבן מעוגל 2" o:spid="_x0000_s1026" style="width:9.45pt;height:9.45pt;visibility:visible;mso-wrap-style:square;mso-left-percent:-10001;mso-top-percent:-10001;mso-position-horizontal:absolute;mso-position-horizontal-relative:char;mso-position-vertical:absolute;mso-position-vertical-relative:line;mso-left-percent:-10001;mso-top-percent:-10001;v-text-anchor:top" arcsize="10923f" o:gfxdata="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">
                 <o:lock v:ext="edit" aspectratio="t"/>
@@ -4700,7 +4701,7 @@
               </wp:inline>
             </w:drawing>
           </mc:Choice>
-          <mc:Fallback xmlns:w16cex="http://schemas.microsoft.com/office/word/2018/wordml/cex" xmlns:w16="http://schemas.microsoft.com/office/word/2018/wordml" xmlns:w16sdtdh="http://schemas.microsoft.com/office/word/2020/wordml/sdtdatahash" xmlns:w16du="http://schemas.microsoft.com/office/word/2023/wordml/word16du" xmlns:oel="http://schemas.microsoft.com/office/2019/extlst">
+          <mc:Fallback>
             <w:pict>
               <v:roundrect w14:anchorId="4AE4CB54" id="מלבן מעוגל 1" o:spid="_x0000_s1026" style="width:9.45pt;height:9.45pt;visibility:visible;mso-wrap-style:square;mso-left-percent:-10001;mso-top-percent:-10001;mso-position-horizontal:absolute;mso-position-horizontal-relative:char;mso-position-vertical:absolute;mso-position-vertical-relative:line;mso-left-percent:-10001;mso-top-percent:-10001;v-text-anchor:top" arcsize="10923f" o:gfxdata="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">
                 <o:lock v:ext="edit" aspectratio="t"/>
@@ -5070,7 +5071,7 @@
         <mc:AlternateContent>
           <mc:Choice Requires="wpg">
             <w:drawing>
-              <wp:anchor distT="0" distB="0" distL="114300" distR="114300" simplePos="0" relativeHeight="251658240" behindDoc="1" locked="0" layoutInCell="1" allowOverlap="1" wp14:editId="20A1B0C3">
+              <wp:anchor distT="0" distB="0" distL="114300" distR="114300" simplePos="0" relativeHeight="251658240" behindDoc="1" locked="0" layoutInCell="1" allowOverlap="1" wp14:anchorId="2BDD8CC3" wp14:editId="20A1B0C3">
                 <wp:simplePos x="0" y="0"/>
                 <wp:positionH relativeFrom="page">
                   <wp:posOffset>1073785</wp:posOffset>
@@ -5525,7 +5526,7 @@
         <mc:AlternateContent>
           <mc:Choice Requires="wpg">
             <w:drawing>
-              <wp:anchor distT="0" distB="0" distL="114300" distR="114300" simplePos="0" relativeHeight="251663360" behindDoc="1" locked="0" layoutInCell="1" allowOverlap="1" wp14:editId="610BA05D">
+              <wp:anchor distT="0" distB="0" distL="114300" distR="114300" simplePos="0" relativeHeight="251663360" behindDoc="1" locked="0" layoutInCell="1" allowOverlap="1" wp14:anchorId="6D6DF040" wp14:editId="610BA05D">
                 <wp:simplePos x="0" y="0"/>
                 <wp:positionH relativeFrom="page">
                   <wp:posOffset>1073785</wp:posOffset>
@@ -5687,8 +5688,6 @@
           </mc:Fallback>
         </mc:AlternateContent>
       </w:r>
-      <w:bookmarkStart w:id="2" w:name="_GoBack"/>
-      <w:bookmarkEnd w:id="2"/>
     </w:p>
     <w:p>
       <w:pPr>
@@ -5719,7 +5718,7 @@
 </file>
 
 <file path=word/numbering.xml><?xml version="1.0" encoding="utf-8"?>
-<w:numbering xmlns:wpc="http://schemas.microsoft.com/office/word/2010/wordprocessingCanvas" xmlns:cx="http://schemas.microsoft.com/office/drawing/2014/chartex" xmlns:cx1="http://schemas.microsoft.com/office/drawing/2015/9/8/chartex" xmlns:cx2="http://schemas.microsoft.com/office/drawing/2015/10/21/chartex" xmlns:cx3="http://schemas.microsoft.com/office/drawing/2016/5/9/chartex" xmlns:cx4="http://schemas.microsoft.com/office/drawing/2016/5/10/chartex" xmlns:cx5="http://schemas.microsoft.com/office/drawing/2016/5/11/chartex" xmlns:cx6="http://schemas.microsoft.com/office/drawing/2016/5/12/chartex" xmlns:cx7="http://schemas.microsoft.com/office/drawing/2016/5/13/chartex" xmlns:cx8="http://schemas.microsoft.com/office/drawing/2016/5/14/chartex" xmlns:mc="http://schemas.openxmlformats.org/markup-compatibility/2006" xmlns:aink="http://schemas.microsoft.com/office/drawing/2016/ink" xmlns:am3d="http://schemas.microsoft.com/office/drawing/2017/model3d" xmlns:o="urn:schemas-microsoft-com:office:office" xmlns:r="http://schemas.openxmlformats.org/officeDocument/2006/relationships" xmlns:m="http://schemas.openxmlformats.org/officeDocument/2006/math" xmlns:v="urn:schemas-microsoft-com:vml" xmlns:wp14="http://schemas.microsoft.com/office/word/2010/wordprocessingDrawing" xmlns:wp="http://schemas.openxmlformats.org/drawingml/2006/wordprocessingDrawing" xmlns:w10="urn:schemas-microsoft-com:office:word" xmlns:w="http://schemas.openxmlformats.org/wordprocessingml/2006/main" xmlns:w14="http://schemas.microsoft.com/office/word/2010/wordml" xmlns:w15="http://schemas.microsoft.com/office/word/2012/wordml" xmlns:w16cid="http://schemas.microsoft.com/office/word/2016/wordml/cid" xmlns:w16se="http://schemas.microsoft.com/office/word/2015/wordml/symex" xmlns:wpg="http://schemas.microsoft.com/office/word/2010/wordprocessingGroup" xmlns:wpi="http://schemas.microsoft.com/office/word/2010/wordprocessingInk" xmlns:wne="http://schemas.microsoft.com/office/word/2006/wordml" xmlns:wps="http://schemas.microsoft.com/office/word/2010/wordprocessingShape" mc:Ignorable="w14 w15 w16se w16cid wp14">
+<w:numbering xmlns:wpc="http://schemas.microsoft.com/office/word/2010/wordprocessingCanvas" xmlns:cx="http://schemas.microsoft.com/office/drawing/2014/chartex" xmlns:cx1="http://schemas.microsoft.com/office/drawing/2015/9/8/chartex" xmlns:cx2="http://schemas.microsoft.com/office/drawing/2015/10/21/chartex" xmlns:cx3="http://schemas.microsoft.com/office/drawing/2016/5/9/chartex" xmlns:cx4="http://schemas.microsoft.com/office/drawing/2016/5/10/chartex" xmlns:cx5="http://schemas.microsoft.com/office/drawing/2016/5/11/chartex" xmlns:cx6="http://schemas.microsoft.com/office/drawing/2016/5/12/chartex" xmlns:cx7="http://schemas.microsoft.com/office/drawing/2016/5/13/chartex" xmlns:cx8="http://schemas.microsoft.com/office/drawing/2016/5/14/chartex" xmlns:mc="http://schemas.openxmlformats.org/markup-compatibility/2006" xmlns:aink="http://schemas.microsoft.com/office/drawing/2016/ink" xmlns:am3d="http://schemas.microsoft.com/office/drawing/2017/model3d" xmlns:o="urn:schemas-microsoft-com:office:office" xmlns:oel="http://schemas.microsoft.com/office/2019/extlst" xmlns:r="http://schemas.openxmlformats.org/officeDocument/2006/relationships" xmlns:m="http://schemas.openxmlformats.org/officeDocument/2006/math" xmlns:v="urn:schemas-microsoft-com:vml" xmlns:wp14="http://schemas.microsoft.com/office/word/2010/wordprocessingDrawing" xmlns:wp="http://schemas.openxmlformats.org/drawingml/2006/wordprocessingDrawing" xmlns:w10="urn:schemas-microsoft-com:office:word" xmlns:w="http://schemas.openxmlformats.org/wordprocessingml/2006/main" xmlns:w14="http://schemas.microsoft.com/office/word/2010/wordml" xmlns:w15="http://schemas.microsoft.com/office/word/2012/wordml" xmlns:w16cex="http://schemas.microsoft.com/office/word/2018/wordml/cex" xmlns:w16cid="http://schemas.microsoft.com/office/word/2016/wordml/cid" xmlns:w16="http://schemas.microsoft.com/office/word/2018/wordml" xmlns:w16du="http://schemas.microsoft.com/office/word/2023/wordml/word16du" xmlns:w16sdtdh="http://schemas.microsoft.com/office/word/2020/wordml/sdtdatahash" xmlns:w16se="http://schemas.microsoft.com/office/word/2015/wordml/symex" xmlns:wpg="http://schemas.microsoft.com/office/word/2010/wordprocessingGroup" xmlns:wpi="http://schemas.microsoft.com/office/word/2010/wordprocessingInk" xmlns:wne="http://schemas.microsoft.com/office/word/2006/wordml" xmlns:wps="http://schemas.microsoft.com/office/word/2010/wordprocessingShape" mc:Ignorable="w14 w15 w16se w16cid w16 w16cex w16sdtdh w16du wp14">
   <w:abstractNum w:abstractNumId="0" w15:restartNumberingAfterBreak="0">
     <w:nsid w:val="0A661114"/>
     <w:multiLevelType w:val="hybridMultilevel"/>
@@ -6153,23 +6152,23 @@
       </w:rPr>
     </w:lvl>
   </w:abstractNum>
-  <w:num w:numId="1">
+  <w:num w:numId="1" w16cid:durableId="1243762092">
     <w:abstractNumId w:val="2"/>
   </w:num>
-  <w:num w:numId="2">
+  <w:num w:numId="2" w16cid:durableId="349374781">
     <w:abstractNumId w:val="0"/>
   </w:num>
-  <w:num w:numId="3">
+  <w:num w:numId="3" w16cid:durableId="33778456">
     <w:abstractNumId w:val="3"/>
   </w:num>
-  <w:num w:numId="4">
+  <w:num w:numId="4" w16cid:durableId="668993480">
     <w:abstractNumId w:val="1"/>
   </w:num>
 </w:numbering>
 </file>
 
 <file path=word/styles.xml><?xml version="1.0" encoding="utf-8"?>
-<w:styles xmlns:mc="http://schemas.openxmlformats.org/markup-compatibility/2006" xmlns:r="http://schemas.openxmlformats.org/officeDocument/2006/relationships" xmlns:w="http://schemas.openxmlformats.org/wordprocessingml/2006/main" xmlns:w14="http://schemas.microsoft.com/office/word/2010/wordml" xmlns:w15="http://schemas.microsoft.com/office/word/2012/wordml" xmlns:w16cid="http://schemas.microsoft.com/office/word/2016/wordml/cid" xmlns:w16se="http://schemas.microsoft.com/office/word/2015/wordml/symex" mc:Ignorable="w14 w15 w16se w16cid">
+<w:styles xmlns:mc="http://schemas.openxmlformats.org/markup-compatibility/2006" xmlns:r="http://schemas.openxmlformats.org/officeDocument/2006/relationships" xmlns:w="http://schemas.openxmlformats.org/wordprocessingml/2006/main" xmlns:w14="http://schemas.microsoft.com/office/word/2010/wordml" xmlns:w15="http://schemas.microsoft.com/office/word/2012/wordml" xmlns:w16cex="http://schemas.microsoft.com/office/word/2018/wordml/cex" xmlns:w16cid="http://schemas.microsoft.com/office/word/2016/wordml/cid" xmlns:w16="http://schemas.microsoft.com/office/word/2018/wordml" xmlns:w16du="http://schemas.microsoft.com/office/word/2023/wordml/word16du" xmlns:w16sdtdh="http://schemas.microsoft.com/office/word/2020/wordml/sdtdatahash" xmlns:w16se="http://schemas.microsoft.com/office/word/2015/wordml/symex" mc:Ignorable="w14 w15 w16se w16cid w16 w16cex w16sdtdh w16du">
   <w:docDefaults>
     <w:rPrDefault>
       <w:rPr>
@@ -6188,7 +6187,7 @@
       </w:pPr>
     </w:pPrDefault>
   </w:docDefaults>
-  <w:latentStyles w:defLockedState="0" w:defUIPriority="99" w:defSemiHidden="0" w:defUnhideWhenUsed="0" w:defQFormat="0" w:count="375">
+  <w:latentStyles w:defLockedState="0" w:defUIPriority="99" w:defSemiHidden="0" w:defUnhideWhenUsed="0" w:defQFormat="0" w:count="376">
     <w:lsdException w:name="Normal" w:uiPriority="0" w:qFormat="1"/>
     <w:lsdException w:name="heading 1" w:uiPriority="9" w:qFormat="1"/>
     <w:lsdException w:name="heading 2" w:semiHidden="1" w:uiPriority="9" w:unhideWhenUsed="1" w:qFormat="1"/>
@@ -6564,6 +6563,7 @@
     <w:lsdException w:name="Smart Hyperlink" w:semiHidden="1" w:unhideWhenUsed="1"/>
     <w:lsdException w:name="Hashtag" w:semiHidden="1" w:unhideWhenUsed="1"/>
     <w:lsdException w:name="Unresolved Mention" w:semiHidden="1" w:unhideWhenUsed="1"/>
+    <w:lsdException w:name="Smart Link" w:semiHidden="1" w:unhideWhenUsed="1"/>
   </w:latentStyles>
   <w:style w:type="paragraph" w:default="1" w:styleId="a">
     <w:name w:val="Normal"/>
@@ -6776,7 +6776,6 @@
   <w:style w:type="character" w:default="1" w:styleId="a0">
     <w:name w:val="Default Paragraph Font"/>
     <w:uiPriority w:val="1"/>
-    <w:semiHidden/>
     <w:unhideWhenUsed/>
   </w:style>
   <w:style w:type="table" w:default="1" w:styleId="a1">

</xml_diff>